<commit_message>
fix: close DOCX source consistency gaps
</commit_message>
<xml_diff>
--- a/05_交付物/通俗细分版_2026-08-07/05_编程数学数据分析和可视化/00_大分类总览.docx
+++ b/05_交付物/通俗细分版_2026-08-07/05_编程数学数据分析和可视化/00_大分类总览.docx
@@ -563,6 +563,28 @@
                 <w:t>知识库入口</w:t>
               </w:r>
             </w:hyperlink>
+            <w:r>
+              <w:rPr>
+                <w:rFonts w:ascii="Calibri" w:hAnsi="Calibri" w:eastAsia="Microsoft YaHei"/>
+                <w:b w:val="0"/>
+                <w:i w:val="0"/>
+                <w:color w:val="5B6775"/>
+                <w:sz w:val="22"/>
+              </w:rPr>
+              <w:t xml:space="preserve"> | </w:t>
+            </w:r>
+            <w:hyperlink r:id="rId12">
+              <w:r>
+                <w:rPr>
+                  <w:rFonts w:ascii="Calibri" w:hAnsi="Calibri" w:eastAsia="Microsoft YaHei"/>
+                  <w:color w:val="1F5F8B"/>
+                  <w:u w:val="single"/>
+                  <w:sz w:val="22"/>
+                  <w:szCs w:val="22"/>
+                </w:rPr>
+                <w:t>仓库1</w:t>
+              </w:r>
+            </w:hyperlink>
           </w:p>
         </w:tc>
         <w:tc>
@@ -665,6 +687,28 @@
               </w:rPr>
               <w:br/>
             </w:r>
+            <w:hyperlink r:id="rId13">
+              <w:r>
+                <w:rPr>
+                  <w:rFonts w:ascii="Calibri" w:hAnsi="Calibri" w:eastAsia="Microsoft YaHei"/>
+                  <w:color w:val="1F5F8B"/>
+                  <w:u w:val="single"/>
+                  <w:sz w:val="22"/>
+                  <w:szCs w:val="22"/>
+                </w:rPr>
+                <w:t>知识库入口</w:t>
+              </w:r>
+            </w:hyperlink>
+            <w:r>
+              <w:rPr>
+                <w:rFonts w:ascii="Calibri" w:hAnsi="Calibri" w:eastAsia="Microsoft YaHei"/>
+                <w:b w:val="0"/>
+                <w:i w:val="0"/>
+                <w:color w:val="5B6775"/>
+                <w:sz w:val="22"/>
+              </w:rPr>
+              <w:t xml:space="preserve"> | </w:t>
+            </w:r>
             <w:hyperlink r:id="rId12">
               <w:r>
                 <w:rPr>
@@ -674,7 +718,29 @@
                   <w:sz w:val="22"/>
                   <w:szCs w:val="22"/>
                 </w:rPr>
-                <w:t>知识库入口</w:t>
+                <w:t>仓库1</w:t>
+              </w:r>
+            </w:hyperlink>
+            <w:r>
+              <w:rPr>
+                <w:rFonts w:ascii="Calibri" w:hAnsi="Calibri" w:eastAsia="Microsoft YaHei"/>
+                <w:b w:val="0"/>
+                <w:i w:val="0"/>
+                <w:color w:val="5B6775"/>
+                <w:sz w:val="22"/>
+              </w:rPr>
+              <w:t xml:space="preserve"> | </w:t>
+            </w:r>
+            <w:hyperlink r:id="rId14">
+              <w:r>
+                <w:rPr>
+                  <w:rFonts w:ascii="Calibri" w:hAnsi="Calibri" w:eastAsia="Microsoft YaHei"/>
+                  <w:color w:val="1F5F8B"/>
+                  <w:u w:val="single"/>
+                  <w:sz w:val="22"/>
+                  <w:szCs w:val="22"/>
+                </w:rPr>
+                <w:t>仓库2</w:t>
               </w:r>
             </w:hyperlink>
           </w:p>
@@ -779,7 +845,7 @@
               </w:rPr>
               <w:br/>
             </w:r>
-            <w:hyperlink r:id="rId13">
+            <w:hyperlink r:id="rId15">
               <w:r>
                 <w:rPr>
                   <w:rFonts w:ascii="Calibri" w:hAnsi="Calibri" w:eastAsia="Microsoft YaHei"/>
@@ -789,6 +855,28 @@
                   <w:szCs w:val="22"/>
                 </w:rPr>
                 <w:t>知识库入口</w:t>
+              </w:r>
+            </w:hyperlink>
+            <w:r>
+              <w:rPr>
+                <w:rFonts w:ascii="Calibri" w:hAnsi="Calibri" w:eastAsia="Microsoft YaHei"/>
+                <w:b w:val="0"/>
+                <w:i w:val="0"/>
+                <w:color w:val="5B6775"/>
+                <w:sz w:val="22"/>
+              </w:rPr>
+              <w:t xml:space="preserve"> | </w:t>
+            </w:r>
+            <w:hyperlink r:id="rId12">
+              <w:r>
+                <w:rPr>
+                  <w:rFonts w:ascii="Calibri" w:hAnsi="Calibri" w:eastAsia="Microsoft YaHei"/>
+                  <w:color w:val="1F5F8B"/>
+                  <w:u w:val="single"/>
+                  <w:sz w:val="22"/>
+                  <w:szCs w:val="22"/>
+                </w:rPr>
+                <w:t>仓库1</w:t>
               </w:r>
             </w:hyperlink>
           </w:p>
@@ -893,6 +981,50 @@
               </w:rPr>
               <w:br/>
             </w:r>
+            <w:hyperlink r:id="rId16">
+              <w:r>
+                <w:rPr>
+                  <w:rFonts w:ascii="Calibri" w:hAnsi="Calibri" w:eastAsia="Microsoft YaHei"/>
+                  <w:color w:val="1F5F8B"/>
+                  <w:u w:val="single"/>
+                  <w:sz w:val="22"/>
+                  <w:szCs w:val="22"/>
+                </w:rPr>
+                <w:t>知识库入口</w:t>
+              </w:r>
+            </w:hyperlink>
+            <w:r>
+              <w:rPr>
+                <w:rFonts w:ascii="Calibri" w:hAnsi="Calibri" w:eastAsia="Microsoft YaHei"/>
+                <w:b w:val="0"/>
+                <w:i w:val="0"/>
+                <w:color w:val="5B6775"/>
+                <w:sz w:val="22"/>
+              </w:rPr>
+              <w:t xml:space="preserve"> | </w:t>
+            </w:r>
+            <w:hyperlink r:id="rId12">
+              <w:r>
+                <w:rPr>
+                  <w:rFonts w:ascii="Calibri" w:hAnsi="Calibri" w:eastAsia="Microsoft YaHei"/>
+                  <w:color w:val="1F5F8B"/>
+                  <w:u w:val="single"/>
+                  <w:sz w:val="22"/>
+                  <w:szCs w:val="22"/>
+                </w:rPr>
+                <w:t>仓库1</w:t>
+              </w:r>
+            </w:hyperlink>
+            <w:r>
+              <w:rPr>
+                <w:rFonts w:ascii="Calibri" w:hAnsi="Calibri" w:eastAsia="Microsoft YaHei"/>
+                <w:b w:val="0"/>
+                <w:i w:val="0"/>
+                <w:color w:val="5B6775"/>
+                <w:sz w:val="22"/>
+              </w:rPr>
+              <w:t xml:space="preserve"> | </w:t>
+            </w:r>
             <w:hyperlink r:id="rId14">
               <w:r>
                 <w:rPr>
@@ -902,7 +1034,7 @@
                   <w:sz w:val="22"/>
                   <w:szCs w:val="22"/>
                 </w:rPr>
-                <w:t>知识库入口</w:t>
+                <w:t>仓库2</w:t>
               </w:r>
             </w:hyperlink>
           </w:p>
@@ -1007,7 +1139,7 @@
               </w:rPr>
               <w:br/>
             </w:r>
-            <w:hyperlink r:id="rId15">
+            <w:hyperlink r:id="rId17">
               <w:r>
                 <w:rPr>
                   <w:rFonts w:ascii="Calibri" w:hAnsi="Calibri" w:eastAsia="Microsoft YaHei"/>
@@ -1017,6 +1149,50 @@
                   <w:szCs w:val="22"/>
                 </w:rPr>
                 <w:t>知识库入口</w:t>
+              </w:r>
+            </w:hyperlink>
+            <w:r>
+              <w:rPr>
+                <w:rFonts w:ascii="Calibri" w:hAnsi="Calibri" w:eastAsia="Microsoft YaHei"/>
+                <w:b w:val="0"/>
+                <w:i w:val="0"/>
+                <w:color w:val="5B6775"/>
+                <w:sz w:val="22"/>
+              </w:rPr>
+              <w:t xml:space="preserve"> | </w:t>
+            </w:r>
+            <w:hyperlink r:id="rId12">
+              <w:r>
+                <w:rPr>
+                  <w:rFonts w:ascii="Calibri" w:hAnsi="Calibri" w:eastAsia="Microsoft YaHei"/>
+                  <w:color w:val="1F5F8B"/>
+                  <w:u w:val="single"/>
+                  <w:sz w:val="22"/>
+                  <w:szCs w:val="22"/>
+                </w:rPr>
+                <w:t>仓库1</w:t>
+              </w:r>
+            </w:hyperlink>
+            <w:r>
+              <w:rPr>
+                <w:rFonts w:ascii="Calibri" w:hAnsi="Calibri" w:eastAsia="Microsoft YaHei"/>
+                <w:b w:val="0"/>
+                <w:i w:val="0"/>
+                <w:color w:val="5B6775"/>
+                <w:sz w:val="22"/>
+              </w:rPr>
+              <w:t xml:space="preserve"> | </w:t>
+            </w:r>
+            <w:hyperlink r:id="rId14">
+              <w:r>
+                <w:rPr>
+                  <w:rFonts w:ascii="Calibri" w:hAnsi="Calibri" w:eastAsia="Microsoft YaHei"/>
+                  <w:color w:val="1F5F8B"/>
+                  <w:u w:val="single"/>
+                  <w:sz w:val="22"/>
+                  <w:szCs w:val="22"/>
+                </w:rPr>
+                <w:t>仓库2</w:t>
               </w:r>
             </w:hyperlink>
           </w:p>
@@ -1121,7 +1297,7 @@
               </w:rPr>
               <w:br/>
             </w:r>
-            <w:hyperlink r:id="rId16">
+            <w:hyperlink r:id="rId18">
               <w:r>
                 <w:rPr>
                   <w:rFonts w:ascii="Calibri" w:hAnsi="Calibri" w:eastAsia="Microsoft YaHei"/>
@@ -1131,6 +1307,28 @@
                   <w:szCs w:val="22"/>
                 </w:rPr>
                 <w:t>知识库入口</w:t>
+              </w:r>
+            </w:hyperlink>
+            <w:r>
+              <w:rPr>
+                <w:rFonts w:ascii="Calibri" w:hAnsi="Calibri" w:eastAsia="Microsoft YaHei"/>
+                <w:b w:val="0"/>
+                <w:i w:val="0"/>
+                <w:color w:val="5B6775"/>
+                <w:sz w:val="22"/>
+              </w:rPr>
+              <w:t xml:space="preserve"> | </w:t>
+            </w:r>
+            <w:hyperlink r:id="rId12">
+              <w:r>
+                <w:rPr>
+                  <w:rFonts w:ascii="Calibri" w:hAnsi="Calibri" w:eastAsia="Microsoft YaHei"/>
+                  <w:color w:val="1F5F8B"/>
+                  <w:u w:val="single"/>
+                  <w:sz w:val="22"/>
+                  <w:szCs w:val="22"/>
+                </w:rPr>
+                <w:t>仓库1</w:t>
               </w:r>
             </w:hyperlink>
           </w:p>
@@ -1235,7 +1433,7 @@
               </w:rPr>
               <w:br/>
             </w:r>
-            <w:hyperlink r:id="rId17">
+            <w:hyperlink r:id="rId19">
               <w:r>
                 <w:rPr>
                   <w:rFonts w:ascii="Calibri" w:hAnsi="Calibri" w:eastAsia="Microsoft YaHei"/>
@@ -1245,6 +1443,28 @@
                   <w:szCs w:val="22"/>
                 </w:rPr>
                 <w:t>知识库入口</w:t>
+              </w:r>
+            </w:hyperlink>
+            <w:r>
+              <w:rPr>
+                <w:rFonts w:ascii="Calibri" w:hAnsi="Calibri" w:eastAsia="Microsoft YaHei"/>
+                <w:b w:val="0"/>
+                <w:i w:val="0"/>
+                <w:color w:val="5B6775"/>
+                <w:sz w:val="22"/>
+              </w:rPr>
+              <w:t xml:space="preserve"> | </w:t>
+            </w:r>
+            <w:hyperlink r:id="rId12">
+              <w:r>
+                <w:rPr>
+                  <w:rFonts w:ascii="Calibri" w:hAnsi="Calibri" w:eastAsia="Microsoft YaHei"/>
+                  <w:color w:val="1F5F8B"/>
+                  <w:u w:val="single"/>
+                  <w:sz w:val="22"/>
+                  <w:szCs w:val="22"/>
+                </w:rPr>
+                <w:t>仓库1</w:t>
               </w:r>
             </w:hyperlink>
           </w:p>
@@ -1349,7 +1569,7 @@
               </w:rPr>
               <w:br/>
             </w:r>
-            <w:hyperlink r:id="rId18">
+            <w:hyperlink r:id="rId20">
               <w:r>
                 <w:rPr>
                   <w:rFonts w:ascii="Calibri" w:hAnsi="Calibri" w:eastAsia="Microsoft YaHei"/>
@@ -1359,6 +1579,50 @@
                   <w:szCs w:val="22"/>
                 </w:rPr>
                 <w:t>知识库入口</w:t>
+              </w:r>
+            </w:hyperlink>
+            <w:r>
+              <w:rPr>
+                <w:rFonts w:ascii="Calibri" w:hAnsi="Calibri" w:eastAsia="Microsoft YaHei"/>
+                <w:b w:val="0"/>
+                <w:i w:val="0"/>
+                <w:color w:val="5B6775"/>
+                <w:sz w:val="22"/>
+              </w:rPr>
+              <w:t xml:space="preserve"> | </w:t>
+            </w:r>
+            <w:hyperlink r:id="rId12">
+              <w:r>
+                <w:rPr>
+                  <w:rFonts w:ascii="Calibri" w:hAnsi="Calibri" w:eastAsia="Microsoft YaHei"/>
+                  <w:color w:val="1F5F8B"/>
+                  <w:u w:val="single"/>
+                  <w:sz w:val="22"/>
+                  <w:szCs w:val="22"/>
+                </w:rPr>
+                <w:t>仓库1</w:t>
+              </w:r>
+            </w:hyperlink>
+            <w:r>
+              <w:rPr>
+                <w:rFonts w:ascii="Calibri" w:hAnsi="Calibri" w:eastAsia="Microsoft YaHei"/>
+                <w:b w:val="0"/>
+                <w:i w:val="0"/>
+                <w:color w:val="5B6775"/>
+                <w:sz w:val="22"/>
+              </w:rPr>
+              <w:t xml:space="preserve"> | </w:t>
+            </w:r>
+            <w:hyperlink r:id="rId21">
+              <w:r>
+                <w:rPr>
+                  <w:rFonts w:ascii="Calibri" w:hAnsi="Calibri" w:eastAsia="Microsoft YaHei"/>
+                  <w:color w:val="1F5F8B"/>
+                  <w:u w:val="single"/>
+                  <w:sz w:val="22"/>
+                  <w:szCs w:val="22"/>
+                </w:rPr>
+                <w:t>仓库2</w:t>
               </w:r>
             </w:hyperlink>
           </w:p>
@@ -1463,7 +1727,7 @@
               </w:rPr>
               <w:br/>
             </w:r>
-            <w:hyperlink r:id="rId19">
+            <w:hyperlink r:id="rId22">
               <w:r>
                 <w:rPr>
                   <w:rFonts w:ascii="Calibri" w:hAnsi="Calibri" w:eastAsia="Microsoft YaHei"/>
@@ -1473,6 +1737,28 @@
                   <w:szCs w:val="22"/>
                 </w:rPr>
                 <w:t>知识库入口</w:t>
+              </w:r>
+            </w:hyperlink>
+            <w:r>
+              <w:rPr>
+                <w:rFonts w:ascii="Calibri" w:hAnsi="Calibri" w:eastAsia="Microsoft YaHei"/>
+                <w:b w:val="0"/>
+                <w:i w:val="0"/>
+                <w:color w:val="5B6775"/>
+                <w:sz w:val="22"/>
+              </w:rPr>
+              <w:t xml:space="preserve"> | </w:t>
+            </w:r>
+            <w:hyperlink r:id="rId12">
+              <w:r>
+                <w:rPr>
+                  <w:rFonts w:ascii="Calibri" w:hAnsi="Calibri" w:eastAsia="Microsoft YaHei"/>
+                  <w:color w:val="1F5F8B"/>
+                  <w:u w:val="single"/>
+                  <w:sz w:val="22"/>
+                  <w:szCs w:val="22"/>
+                </w:rPr>
+                <w:t>仓库1</w:t>
               </w:r>
             </w:hyperlink>
           </w:p>
@@ -1577,7 +1863,7 @@
               </w:rPr>
               <w:br/>
             </w:r>
-            <w:hyperlink r:id="rId20">
+            <w:hyperlink r:id="rId23">
               <w:r>
                 <w:rPr>
                   <w:rFonts w:ascii="Calibri" w:hAnsi="Calibri" w:eastAsia="Microsoft YaHei"/>
@@ -1587,6 +1873,28 @@
                   <w:szCs w:val="22"/>
                 </w:rPr>
                 <w:t>知识库入口</w:t>
+              </w:r>
+            </w:hyperlink>
+            <w:r>
+              <w:rPr>
+                <w:rFonts w:ascii="Calibri" w:hAnsi="Calibri" w:eastAsia="Microsoft YaHei"/>
+                <w:b w:val="0"/>
+                <w:i w:val="0"/>
+                <w:color w:val="5B6775"/>
+                <w:sz w:val="22"/>
+              </w:rPr>
+              <w:t xml:space="preserve"> | </w:t>
+            </w:r>
+            <w:hyperlink r:id="rId12">
+              <w:r>
+                <w:rPr>
+                  <w:rFonts w:ascii="Calibri" w:hAnsi="Calibri" w:eastAsia="Microsoft YaHei"/>
+                  <w:color w:val="1F5F8B"/>
+                  <w:u w:val="single"/>
+                  <w:sz w:val="22"/>
+                  <w:szCs w:val="22"/>
+                </w:rPr>
+                <w:t>仓库1</w:t>
               </w:r>
             </w:hyperlink>
           </w:p>
@@ -1691,7 +1999,7 @@
               </w:rPr>
               <w:br/>
             </w:r>
-            <w:hyperlink r:id="rId21">
+            <w:hyperlink r:id="rId24">
               <w:r>
                 <w:rPr>
                   <w:rFonts w:ascii="Calibri" w:hAnsi="Calibri" w:eastAsia="Microsoft YaHei"/>
@@ -1701,6 +2009,28 @@
                   <w:szCs w:val="22"/>
                 </w:rPr>
                 <w:t>知识库入口</w:t>
+              </w:r>
+            </w:hyperlink>
+            <w:r>
+              <w:rPr>
+                <w:rFonts w:ascii="Calibri" w:hAnsi="Calibri" w:eastAsia="Microsoft YaHei"/>
+                <w:b w:val="0"/>
+                <w:i w:val="0"/>
+                <w:color w:val="5B6775"/>
+                <w:sz w:val="22"/>
+              </w:rPr>
+              <w:t xml:space="preserve"> | </w:t>
+            </w:r>
+            <w:hyperlink r:id="rId12">
+              <w:r>
+                <w:rPr>
+                  <w:rFonts w:ascii="Calibri" w:hAnsi="Calibri" w:eastAsia="Microsoft YaHei"/>
+                  <w:color w:val="1F5F8B"/>
+                  <w:u w:val="single"/>
+                  <w:sz w:val="22"/>
+                  <w:szCs w:val="22"/>
+                </w:rPr>
+                <w:t>仓库1</w:t>
               </w:r>
             </w:hyperlink>
           </w:p>
@@ -1805,7 +2135,7 @@
               </w:rPr>
               <w:br/>
             </w:r>
-            <w:hyperlink r:id="rId22">
+            <w:hyperlink r:id="rId25">
               <w:r>
                 <w:rPr>
                   <w:rFonts w:ascii="Calibri" w:hAnsi="Calibri" w:eastAsia="Microsoft YaHei"/>
@@ -1815,6 +2145,28 @@
                   <w:szCs w:val="22"/>
                 </w:rPr>
                 <w:t>知识库入口</w:t>
+              </w:r>
+            </w:hyperlink>
+            <w:r>
+              <w:rPr>
+                <w:rFonts w:ascii="Calibri" w:hAnsi="Calibri" w:eastAsia="Microsoft YaHei"/>
+                <w:b w:val="0"/>
+                <w:i w:val="0"/>
+                <w:color w:val="5B6775"/>
+                <w:sz w:val="22"/>
+              </w:rPr>
+              <w:t xml:space="preserve"> | </w:t>
+            </w:r>
+            <w:hyperlink r:id="rId12">
+              <w:r>
+                <w:rPr>
+                  <w:rFonts w:ascii="Calibri" w:hAnsi="Calibri" w:eastAsia="Microsoft YaHei"/>
+                  <w:color w:val="1F5F8B"/>
+                  <w:u w:val="single"/>
+                  <w:sz w:val="22"/>
+                  <w:szCs w:val="22"/>
+                </w:rPr>
+                <w:t>仓库1</w:t>
               </w:r>
             </w:hyperlink>
           </w:p>
@@ -1919,7 +2271,7 @@
               </w:rPr>
               <w:br/>
             </w:r>
-            <w:hyperlink r:id="rId23">
+            <w:hyperlink r:id="rId26">
               <w:r>
                 <w:rPr>
                   <w:rFonts w:ascii="Calibri" w:hAnsi="Calibri" w:eastAsia="Microsoft YaHei"/>
@@ -1929,6 +2281,28 @@
                   <w:szCs w:val="22"/>
                 </w:rPr>
                 <w:t>知识库入口</w:t>
+              </w:r>
+            </w:hyperlink>
+            <w:r>
+              <w:rPr>
+                <w:rFonts w:ascii="Calibri" w:hAnsi="Calibri" w:eastAsia="Microsoft YaHei"/>
+                <w:b w:val="0"/>
+                <w:i w:val="0"/>
+                <w:color w:val="5B6775"/>
+                <w:sz w:val="22"/>
+              </w:rPr>
+              <w:t xml:space="preserve"> | </w:t>
+            </w:r>
+            <w:hyperlink r:id="rId27">
+              <w:r>
+                <w:rPr>
+                  <w:rFonts w:ascii="Calibri" w:hAnsi="Calibri" w:eastAsia="Microsoft YaHei"/>
+                  <w:color w:val="1F5F8B"/>
+                  <w:u w:val="single"/>
+                  <w:sz w:val="22"/>
+                  <w:szCs w:val="22"/>
+                </w:rPr>
+                <w:t>仓库1</w:t>
               </w:r>
             </w:hyperlink>
           </w:p>
@@ -2033,7 +2407,7 @@
               </w:rPr>
               <w:br/>
             </w:r>
-            <w:hyperlink r:id="rId24">
+            <w:hyperlink r:id="rId28">
               <w:r>
                 <w:rPr>
                   <w:rFonts w:ascii="Calibri" w:hAnsi="Calibri" w:eastAsia="Microsoft YaHei"/>
@@ -2043,6 +2417,28 @@
                   <w:szCs w:val="22"/>
                 </w:rPr>
                 <w:t>知识库入口</w:t>
+              </w:r>
+            </w:hyperlink>
+            <w:r>
+              <w:rPr>
+                <w:rFonts w:ascii="Calibri" w:hAnsi="Calibri" w:eastAsia="Microsoft YaHei"/>
+                <w:b w:val="0"/>
+                <w:i w:val="0"/>
+                <w:color w:val="5B6775"/>
+                <w:sz w:val="22"/>
+              </w:rPr>
+              <w:t xml:space="preserve"> | </w:t>
+            </w:r>
+            <w:hyperlink r:id="rId12">
+              <w:r>
+                <w:rPr>
+                  <w:rFonts w:ascii="Calibri" w:hAnsi="Calibri" w:eastAsia="Microsoft YaHei"/>
+                  <w:color w:val="1F5F8B"/>
+                  <w:u w:val="single"/>
+                  <w:sz w:val="22"/>
+                  <w:szCs w:val="22"/>
+                </w:rPr>
+                <w:t>仓库1</w:t>
               </w:r>
             </w:hyperlink>
           </w:p>
@@ -2147,7 +2543,7 @@
               </w:rPr>
               <w:br/>
             </w:r>
-            <w:hyperlink r:id="rId25">
+            <w:hyperlink r:id="rId29">
               <w:r>
                 <w:rPr>
                   <w:rFonts w:ascii="Calibri" w:hAnsi="Calibri" w:eastAsia="Microsoft YaHei"/>
@@ -2157,6 +2553,72 @@
                   <w:szCs w:val="22"/>
                 </w:rPr>
                 <w:t>知识库入口</w:t>
+              </w:r>
+            </w:hyperlink>
+            <w:r>
+              <w:rPr>
+                <w:rFonts w:ascii="Calibri" w:hAnsi="Calibri" w:eastAsia="Microsoft YaHei"/>
+                <w:b w:val="0"/>
+                <w:i w:val="0"/>
+                <w:color w:val="5B6775"/>
+                <w:sz w:val="22"/>
+              </w:rPr>
+              <w:t xml:space="preserve"> | </w:t>
+            </w:r>
+            <w:hyperlink r:id="rId12">
+              <w:r>
+                <w:rPr>
+                  <w:rFonts w:ascii="Calibri" w:hAnsi="Calibri" w:eastAsia="Microsoft YaHei"/>
+                  <w:color w:val="1F5F8B"/>
+                  <w:u w:val="single"/>
+                  <w:sz w:val="22"/>
+                  <w:szCs w:val="22"/>
+                </w:rPr>
+                <w:t>仓库1</w:t>
+              </w:r>
+            </w:hyperlink>
+            <w:r>
+              <w:rPr>
+                <w:rFonts w:ascii="Calibri" w:hAnsi="Calibri" w:eastAsia="Microsoft YaHei"/>
+                <w:b w:val="0"/>
+                <w:i w:val="0"/>
+                <w:color w:val="5B6775"/>
+                <w:sz w:val="22"/>
+              </w:rPr>
+              <w:t xml:space="preserve"> | </w:t>
+            </w:r>
+            <w:hyperlink r:id="rId21">
+              <w:r>
+                <w:rPr>
+                  <w:rFonts w:ascii="Calibri" w:hAnsi="Calibri" w:eastAsia="Microsoft YaHei"/>
+                  <w:color w:val="1F5F8B"/>
+                  <w:u w:val="single"/>
+                  <w:sz w:val="22"/>
+                  <w:szCs w:val="22"/>
+                </w:rPr>
+                <w:t>仓库2</w:t>
+              </w:r>
+            </w:hyperlink>
+            <w:r>
+              <w:rPr>
+                <w:rFonts w:ascii="Calibri" w:hAnsi="Calibri" w:eastAsia="Microsoft YaHei"/>
+                <w:b w:val="0"/>
+                <w:i w:val="0"/>
+                <w:color w:val="5B6775"/>
+                <w:sz w:val="22"/>
+              </w:rPr>
+              <w:t xml:space="preserve"> | </w:t>
+            </w:r>
+            <w:hyperlink r:id="rId30">
+              <w:r>
+                <w:rPr>
+                  <w:rFonts w:ascii="Calibri" w:hAnsi="Calibri" w:eastAsia="Microsoft YaHei"/>
+                  <w:color w:val="1F5F8B"/>
+                  <w:u w:val="single"/>
+                  <w:sz w:val="22"/>
+                  <w:szCs w:val="22"/>
+                </w:rPr>
+                <w:t>仓库3</w:t>
               </w:r>
             </w:hyperlink>
           </w:p>
@@ -2261,7 +2723,7 @@
               </w:rPr>
               <w:br/>
             </w:r>
-            <w:hyperlink r:id="rId26">
+            <w:hyperlink r:id="rId31">
               <w:r>
                 <w:rPr>
                   <w:rFonts w:ascii="Calibri" w:hAnsi="Calibri" w:eastAsia="Microsoft YaHei"/>
@@ -2271,6 +2733,72 @@
                   <w:szCs w:val="22"/>
                 </w:rPr>
                 <w:t>知识库入口</w:t>
+              </w:r>
+            </w:hyperlink>
+            <w:r>
+              <w:rPr>
+                <w:rFonts w:ascii="Calibri" w:hAnsi="Calibri" w:eastAsia="Microsoft YaHei"/>
+                <w:b w:val="0"/>
+                <w:i w:val="0"/>
+                <w:color w:val="5B6775"/>
+                <w:sz w:val="22"/>
+              </w:rPr>
+              <w:t xml:space="preserve"> | </w:t>
+            </w:r>
+            <w:hyperlink r:id="rId21">
+              <w:r>
+                <w:rPr>
+                  <w:rFonts w:ascii="Calibri" w:hAnsi="Calibri" w:eastAsia="Microsoft YaHei"/>
+                  <w:color w:val="1F5F8B"/>
+                  <w:u w:val="single"/>
+                  <w:sz w:val="22"/>
+                  <w:szCs w:val="22"/>
+                </w:rPr>
+                <w:t>仓库1</w:t>
+              </w:r>
+            </w:hyperlink>
+            <w:r>
+              <w:rPr>
+                <w:rFonts w:ascii="Calibri" w:hAnsi="Calibri" w:eastAsia="Microsoft YaHei"/>
+                <w:b w:val="0"/>
+                <w:i w:val="0"/>
+                <w:color w:val="5B6775"/>
+                <w:sz w:val="22"/>
+              </w:rPr>
+              <w:t xml:space="preserve"> | </w:t>
+            </w:r>
+            <w:hyperlink r:id="rId30">
+              <w:r>
+                <w:rPr>
+                  <w:rFonts w:ascii="Calibri" w:hAnsi="Calibri" w:eastAsia="Microsoft YaHei"/>
+                  <w:color w:val="1F5F8B"/>
+                  <w:u w:val="single"/>
+                  <w:sz w:val="22"/>
+                  <w:szCs w:val="22"/>
+                </w:rPr>
+                <w:t>仓库2</w:t>
+              </w:r>
+            </w:hyperlink>
+            <w:r>
+              <w:rPr>
+                <w:rFonts w:ascii="Calibri" w:hAnsi="Calibri" w:eastAsia="Microsoft YaHei"/>
+                <w:b w:val="0"/>
+                <w:i w:val="0"/>
+                <w:color w:val="5B6775"/>
+                <w:sz w:val="22"/>
+              </w:rPr>
+              <w:t xml:space="preserve"> | </w:t>
+            </w:r>
+            <w:hyperlink r:id="rId14">
+              <w:r>
+                <w:rPr>
+                  <w:rFonts w:ascii="Calibri" w:hAnsi="Calibri" w:eastAsia="Microsoft YaHei"/>
+                  <w:color w:val="1F5F8B"/>
+                  <w:u w:val="single"/>
+                  <w:sz w:val="22"/>
+                  <w:szCs w:val="22"/>
+                </w:rPr>
+                <w:t>仓库3</w:t>
               </w:r>
             </w:hyperlink>
           </w:p>
@@ -2375,7 +2903,7 @@
               </w:rPr>
               <w:br/>
             </w:r>
-            <w:hyperlink r:id="rId27">
+            <w:hyperlink r:id="rId32">
               <w:r>
                 <w:rPr>
                   <w:rFonts w:ascii="Calibri" w:hAnsi="Calibri" w:eastAsia="Microsoft YaHei"/>
@@ -2385,6 +2913,50 @@
                   <w:szCs w:val="22"/>
                 </w:rPr>
                 <w:t>知识库入口</w:t>
+              </w:r>
+            </w:hyperlink>
+            <w:r>
+              <w:rPr>
+                <w:rFonts w:ascii="Calibri" w:hAnsi="Calibri" w:eastAsia="Microsoft YaHei"/>
+                <w:b w:val="0"/>
+                <w:i w:val="0"/>
+                <w:color w:val="5B6775"/>
+                <w:sz w:val="22"/>
+              </w:rPr>
+              <w:t xml:space="preserve"> | </w:t>
+            </w:r>
+            <w:hyperlink r:id="rId33">
+              <w:r>
+                <w:rPr>
+                  <w:rFonts w:ascii="Calibri" w:hAnsi="Calibri" w:eastAsia="Microsoft YaHei"/>
+                  <w:color w:val="1F5F8B"/>
+                  <w:u w:val="single"/>
+                  <w:sz w:val="22"/>
+                  <w:szCs w:val="22"/>
+                </w:rPr>
+                <w:t>仓库1</w:t>
+              </w:r>
+            </w:hyperlink>
+            <w:r>
+              <w:rPr>
+                <w:rFonts w:ascii="Calibri" w:hAnsi="Calibri" w:eastAsia="Microsoft YaHei"/>
+                <w:b w:val="0"/>
+                <w:i w:val="0"/>
+                <w:color w:val="5B6775"/>
+                <w:sz w:val="22"/>
+              </w:rPr>
+              <w:t xml:space="preserve"> | </w:t>
+            </w:r>
+            <w:hyperlink r:id="rId14">
+              <w:r>
+                <w:rPr>
+                  <w:rFonts w:ascii="Calibri" w:hAnsi="Calibri" w:eastAsia="Microsoft YaHei"/>
+                  <w:color w:val="1F5F8B"/>
+                  <w:u w:val="single"/>
+                  <w:sz w:val="22"/>
+                  <w:szCs w:val="22"/>
+                </w:rPr>
+                <w:t>仓库2</w:t>
               </w:r>
             </w:hyperlink>
           </w:p>
@@ -2489,7 +3061,7 @@
               </w:rPr>
               <w:br/>
             </w:r>
-            <w:hyperlink r:id="rId28">
+            <w:hyperlink r:id="rId34">
               <w:r>
                 <w:rPr>
                   <w:rFonts w:ascii="Calibri" w:hAnsi="Calibri" w:eastAsia="Microsoft YaHei"/>
@@ -2499,6 +3071,50 @@
                   <w:szCs w:val="22"/>
                 </w:rPr>
                 <w:t>知识库入口</w:t>
+              </w:r>
+            </w:hyperlink>
+            <w:r>
+              <w:rPr>
+                <w:rFonts w:ascii="Calibri" w:hAnsi="Calibri" w:eastAsia="Microsoft YaHei"/>
+                <w:b w:val="0"/>
+                <w:i w:val="0"/>
+                <w:color w:val="5B6775"/>
+                <w:sz w:val="22"/>
+              </w:rPr>
+              <w:t xml:space="preserve"> | </w:t>
+            </w:r>
+            <w:hyperlink r:id="rId33">
+              <w:r>
+                <w:rPr>
+                  <w:rFonts w:ascii="Calibri" w:hAnsi="Calibri" w:eastAsia="Microsoft YaHei"/>
+                  <w:color w:val="1F5F8B"/>
+                  <w:u w:val="single"/>
+                  <w:sz w:val="22"/>
+                  <w:szCs w:val="22"/>
+                </w:rPr>
+                <w:t>仓库1</w:t>
+              </w:r>
+            </w:hyperlink>
+            <w:r>
+              <w:rPr>
+                <w:rFonts w:ascii="Calibri" w:hAnsi="Calibri" w:eastAsia="Microsoft YaHei"/>
+                <w:b w:val="0"/>
+                <w:i w:val="0"/>
+                <w:color w:val="5B6775"/>
+                <w:sz w:val="22"/>
+              </w:rPr>
+              <w:t xml:space="preserve"> | </w:t>
+            </w:r>
+            <w:hyperlink r:id="rId14">
+              <w:r>
+                <w:rPr>
+                  <w:rFonts w:ascii="Calibri" w:hAnsi="Calibri" w:eastAsia="Microsoft YaHei"/>
+                  <w:color w:val="1F5F8B"/>
+                  <w:u w:val="single"/>
+                  <w:sz w:val="22"/>
+                  <w:szCs w:val="22"/>
+                </w:rPr>
+                <w:t>仓库2</w:t>
               </w:r>
             </w:hyperlink>
           </w:p>
@@ -2603,7 +3219,7 @@
               </w:rPr>
               <w:br/>
             </w:r>
-            <w:hyperlink r:id="rId29">
+            <w:hyperlink r:id="rId35">
               <w:r>
                 <w:rPr>
                   <w:rFonts w:ascii="Calibri" w:hAnsi="Calibri" w:eastAsia="Microsoft YaHei"/>
@@ -2613,6 +3229,50 @@
                   <w:szCs w:val="22"/>
                 </w:rPr>
                 <w:t>知识库入口</w:t>
+              </w:r>
+            </w:hyperlink>
+            <w:r>
+              <w:rPr>
+                <w:rFonts w:ascii="Calibri" w:hAnsi="Calibri" w:eastAsia="Microsoft YaHei"/>
+                <w:b w:val="0"/>
+                <w:i w:val="0"/>
+                <w:color w:val="5B6775"/>
+                <w:sz w:val="22"/>
+              </w:rPr>
+              <w:t xml:space="preserve"> | </w:t>
+            </w:r>
+            <w:hyperlink r:id="rId33">
+              <w:r>
+                <w:rPr>
+                  <w:rFonts w:ascii="Calibri" w:hAnsi="Calibri" w:eastAsia="Microsoft YaHei"/>
+                  <w:color w:val="1F5F8B"/>
+                  <w:u w:val="single"/>
+                  <w:sz w:val="22"/>
+                  <w:szCs w:val="22"/>
+                </w:rPr>
+                <w:t>仓库1</w:t>
+              </w:r>
+            </w:hyperlink>
+            <w:r>
+              <w:rPr>
+                <w:rFonts w:ascii="Calibri" w:hAnsi="Calibri" w:eastAsia="Microsoft YaHei"/>
+                <w:b w:val="0"/>
+                <w:i w:val="0"/>
+                <w:color w:val="5B6775"/>
+                <w:sz w:val="22"/>
+              </w:rPr>
+              <w:t xml:space="preserve"> | </w:t>
+            </w:r>
+            <w:hyperlink r:id="rId14">
+              <w:r>
+                <w:rPr>
+                  <w:rFonts w:ascii="Calibri" w:hAnsi="Calibri" w:eastAsia="Microsoft YaHei"/>
+                  <w:color w:val="1F5F8B"/>
+                  <w:u w:val="single"/>
+                  <w:sz w:val="22"/>
+                  <w:szCs w:val="22"/>
+                </w:rPr>
+                <w:t>仓库2</w:t>
               </w:r>
             </w:hyperlink>
           </w:p>
@@ -2717,7 +3377,7 @@
               </w:rPr>
               <w:br/>
             </w:r>
-            <w:hyperlink r:id="rId30">
+            <w:hyperlink r:id="rId36">
               <w:r>
                 <w:rPr>
                   <w:rFonts w:ascii="Calibri" w:hAnsi="Calibri" w:eastAsia="Microsoft YaHei"/>
@@ -2727,6 +3387,28 @@
                   <w:szCs w:val="22"/>
                 </w:rPr>
                 <w:t>知识库入口</w:t>
+              </w:r>
+            </w:hyperlink>
+            <w:r>
+              <w:rPr>
+                <w:rFonts w:ascii="Calibri" w:hAnsi="Calibri" w:eastAsia="Microsoft YaHei"/>
+                <w:b w:val="0"/>
+                <w:i w:val="0"/>
+                <w:color w:val="5B6775"/>
+                <w:sz w:val="22"/>
+              </w:rPr>
+              <w:t xml:space="preserve"> | </w:t>
+            </w:r>
+            <w:hyperlink r:id="rId14">
+              <w:r>
+                <w:rPr>
+                  <w:rFonts w:ascii="Calibri" w:hAnsi="Calibri" w:eastAsia="Microsoft YaHei"/>
+                  <w:color w:val="1F5F8B"/>
+                  <w:u w:val="single"/>
+                  <w:sz w:val="22"/>
+                  <w:szCs w:val="22"/>
+                </w:rPr>
+                <w:t>仓库1</w:t>
               </w:r>
             </w:hyperlink>
           </w:p>
@@ -3217,56 +3899,6 @@
     </w:p>
     <w:p>
       <w:pPr>
-        <w:keepLines w:val="0"/>
-      </w:pPr>
-      <w:r>
-        <w:rPr>
-          <w:rFonts w:ascii="Calibri" w:hAnsi="Calibri" w:eastAsia="Microsoft YaHei"/>
-          <w:b/>
-          <w:i w:val="0"/>
-          <w:color w:val="203748"/>
-          <w:sz w:val="22"/>
-        </w:rPr>
-        <w:t>注意事项5：</w:t>
-      </w:r>
-      <w:r>
-        <w:rPr>
-          <w:rFonts w:ascii="Calibri" w:hAnsi="Calibri" w:eastAsia="Microsoft YaHei"/>
-          <w:b w:val="0"/>
-          <w:i w:val="0"/>
-          <w:color w:val="243447"/>
-          <w:sz w:val="22"/>
-        </w:rPr>
-        <w:t>需要注意：并非所有文件格式和表格操作都受支持；延后计算的速度要用实际文件检验。</w:t>
-      </w:r>
-    </w:p>
-    <w:p>
-      <w:pPr>
-        <w:keepLines w:val="0"/>
-      </w:pPr>
-      <w:r>
-        <w:rPr>
-          <w:rFonts w:ascii="Calibri" w:hAnsi="Calibri" w:eastAsia="Microsoft YaHei"/>
-          <w:b/>
-          <w:i w:val="0"/>
-          <w:color w:val="203748"/>
-          <w:sz w:val="22"/>
-        </w:rPr>
-        <w:t>注意事项6：</w:t>
-      </w:r>
-      <w:r>
-        <w:rPr>
-          <w:rFonts w:ascii="Calibri" w:hAnsi="Calibri" w:eastAsia="Microsoft YaHei"/>
-          <w:b w:val="0"/>
-          <w:i w:val="0"/>
-          <w:color w:val="243447"/>
-          <w:sz w:val="22"/>
-        </w:rPr>
-        <w:t>需要注意：分块和压缩设置不合适会拖慢读写；多人写入同一数据时要防止冲突。</w:t>
-      </w:r>
-    </w:p>
-    <w:p>
-      <w:pPr>
         <w:pStyle w:val="Heading1"/>
       </w:pPr>
       <w:r>
@@ -3357,6 +3989,9 @@
       </w:r>
     </w:p>
     <w:p>
+      <w:pPr>
+        <w:keepLines w:val="0"/>
+      </w:pPr>
       <w:r>
         <w:rPr>
           <w:rFonts w:ascii="Calibri" w:hAnsi="Calibri" w:eastAsia="Microsoft YaHei"/>
@@ -3365,180 +4000,18 @@
           <w:color w:val="203748"/>
           <w:sz w:val="22"/>
         </w:rPr>
-        <w:t>K-Dense-AI/scientific-agent-skills：</w:t>
+        <w:t>链接位置：</w:t>
       </w:r>
-      <w:hyperlink r:id="rId31">
-        <w:r>
-          <w:rPr>
-            <w:rFonts w:ascii="Calibri" w:hAnsi="Calibri" w:eastAsia="Microsoft YaHei"/>
-            <w:color w:val="1F5F8B"/>
-            <w:u w:val="single"/>
-            <w:sz w:val="22"/>
-            <w:szCs w:val="22"/>
-          </w:rPr>
-          <w:t>查看仓库</w:t>
-        </w:r>
-      </w:hyperlink>
       <w:r>
         <w:rPr>
           <w:rFonts w:ascii="Calibri" w:hAnsi="Calibri" w:eastAsia="Microsoft YaHei"/>
           <w:b w:val="0"/>
           <w:i w:val="0"/>
-          <w:color w:val="7F8C8D"/>
+          <w:color w:val="243447"/>
           <w:sz w:val="22"/>
         </w:rPr>
-        <w:t xml:space="preserve">　｜　</w:t>
+        <w:t>每个小分类的知识库入口和相关 GitHub 仓库已随导航表逐行列出。</w:t>
       </w:r>
-      <w:r>
-        <w:rPr>
-          <w:rFonts w:ascii="Calibri" w:hAnsi="Calibri" w:eastAsia="Microsoft YaHei"/>
-          <w:b/>
-          <w:i w:val="0"/>
-          <w:color w:val="203748"/>
-          <w:sz w:val="22"/>
-        </w:rPr>
-        <w:t>leanprover/skills：</w:t>
-      </w:r>
-      <w:hyperlink r:id="rId32">
-        <w:r>
-          <w:rPr>
-            <w:rFonts w:ascii="Calibri" w:hAnsi="Calibri" w:eastAsia="Microsoft YaHei"/>
-            <w:color w:val="1F5F8B"/>
-            <w:u w:val="single"/>
-            <w:sz w:val="22"/>
-            <w:szCs w:val="22"/>
-          </w:rPr>
-          <w:t>查看仓库</w:t>
-        </w:r>
-      </w:hyperlink>
-      <w:r>
-        <w:rPr>
-          <w:rFonts w:ascii="Calibri" w:hAnsi="Calibri" w:eastAsia="Microsoft YaHei"/>
-          <w:b w:val="0"/>
-          <w:i w:val="0"/>
-          <w:color w:val="7F8C8D"/>
-          <w:sz w:val="22"/>
-        </w:rPr>
-        <w:t xml:space="preserve">　｜　</w:t>
-      </w:r>
-      <w:r>
-        <w:rPr>
-          <w:rFonts w:ascii="Calibri" w:hAnsi="Calibri" w:eastAsia="Microsoft YaHei"/>
-          <w:b/>
-          <w:i w:val="0"/>
-          <w:color w:val="203748"/>
-          <w:sz w:val="22"/>
-        </w:rPr>
-        <w:t>lyndonkl/claude：</w:t>
-      </w:r>
-      <w:hyperlink r:id="rId33">
-        <w:r>
-          <w:rPr>
-            <w:rFonts w:ascii="Calibri" w:hAnsi="Calibri" w:eastAsia="Microsoft YaHei"/>
-            <w:color w:val="1F5F8B"/>
-            <w:u w:val="single"/>
-            <w:sz w:val="22"/>
-            <w:szCs w:val="22"/>
-          </w:rPr>
-          <w:t>查看仓库</w:t>
-        </w:r>
-      </w:hyperlink>
-      <w:r>
-        <w:rPr>
-          <w:rFonts w:ascii="Calibri" w:hAnsi="Calibri" w:eastAsia="Microsoft YaHei"/>
-          <w:b w:val="0"/>
-          <w:i w:val="0"/>
-          <w:color w:val="7F8C8D"/>
-          <w:sz w:val="22"/>
-        </w:rPr>
-        <w:t xml:space="preserve">　｜　</w:t>
-      </w:r>
-      <w:r>
-        <w:rPr>
-          <w:rFonts w:ascii="Calibri" w:hAnsi="Calibri" w:eastAsia="Microsoft YaHei"/>
-          <w:b/>
-          <w:i w:val="0"/>
-          <w:color w:val="203748"/>
-          <w:sz w:val="22"/>
-        </w:rPr>
-        <w:t>markdown-viewer/skills：</w:t>
-      </w:r>
-      <w:hyperlink r:id="rId34">
-        <w:r>
-          <w:rPr>
-            <w:rFonts w:ascii="Calibri" w:hAnsi="Calibri" w:eastAsia="Microsoft YaHei"/>
-            <w:color w:val="1F5F8B"/>
-            <w:u w:val="single"/>
-            <w:sz w:val="22"/>
-            <w:szCs w:val="22"/>
-          </w:rPr>
-          <w:t>查看仓库</w:t>
-        </w:r>
-      </w:hyperlink>
-      <w:r>
-        <w:rPr>
-          <w:rFonts w:ascii="Calibri" w:hAnsi="Calibri" w:eastAsia="Microsoft YaHei"/>
-          <w:b w:val="0"/>
-          <w:i w:val="0"/>
-          <w:color w:val="7F8C8D"/>
-          <w:sz w:val="22"/>
-        </w:rPr>
-        <w:t xml:space="preserve">　｜　</w:t>
-      </w:r>
-      <w:r>
-        <w:rPr>
-          <w:rFonts w:ascii="Calibri" w:hAnsi="Calibri" w:eastAsia="Microsoft YaHei"/>
-          <w:b/>
-          <w:i w:val="0"/>
-          <w:color w:val="203748"/>
-          <w:sz w:val="22"/>
-        </w:rPr>
-        <w:t>obra/superpowers：</w:t>
-      </w:r>
-      <w:hyperlink r:id="rId35">
-        <w:r>
-          <w:rPr>
-            <w:rFonts w:ascii="Calibri" w:hAnsi="Calibri" w:eastAsia="Microsoft YaHei"/>
-            <w:color w:val="1F5F8B"/>
-            <w:u w:val="single"/>
-            <w:sz w:val="22"/>
-            <w:szCs w:val="22"/>
-          </w:rPr>
-          <w:t>查看仓库</w:t>
-        </w:r>
-      </w:hyperlink>
-      <w:r>
-        <w:rPr>
-          <w:rFonts w:ascii="Calibri" w:hAnsi="Calibri" w:eastAsia="Microsoft YaHei"/>
-          <w:b w:val="0"/>
-          <w:i w:val="0"/>
-          <w:color w:val="7F8C8D"/>
-          <w:sz w:val="22"/>
-        </w:rPr>
-        <w:t xml:space="preserve">　｜　</w:t>
-      </w:r>
-      <w:r>
-        <w:rPr>
-          <w:rFonts w:ascii="Calibri" w:hAnsi="Calibri" w:eastAsia="Microsoft YaHei"/>
-          <w:b/>
-          <w:i w:val="0"/>
-          <w:color w:val="203748"/>
-          <w:sz w:val="22"/>
-        </w:rPr>
-        <w:t>wshobson/agents：</w:t>
-      </w:r>
-      <w:hyperlink r:id="rId36">
-        <w:r>
-          <w:rPr>
-            <w:rFonts w:ascii="Calibri" w:hAnsi="Calibri" w:eastAsia="Microsoft YaHei"/>
-            <w:color w:val="1F5F8B"/>
-            <w:u w:val="single"/>
-            <w:sz w:val="22"/>
-            <w:szCs w:val="22"/>
-          </w:rPr>
-          <w:t>查看仓库</w:t>
-        </w:r>
-      </w:hyperlink>
     </w:p>
     <w:sectPr>
       <w:headerReference w:type="default" r:id="rId9"/>

</xml_diff>